<commit_message>
Soften Fremont Makers sales agreement payment and origin.
Drop Vietnam and the floating-cash lecture. Keep 50/30/20.
Most stock is US warehouse; custom may take longer.
</commit_message>
<xml_diff>
--- a/assets/fremont-makers-sales-agreement.docx
+++ b/assets/fremont-makers-sales-agreement.docx
@@ -257,7 +257,7 @@
           <w:color w:val="222222"/>
           <w:sz w:val="22"/>
         </w:rPr>
-        <w:t>Seller is a reseller, not the manufacturer. The cabinets are sourced from an overseas manufacturer (Vietnam), packed flat, and shipped to Cañon City, Colorado. Lead times are estimates only. Delays caused by manufacturing, ocean freight, customs, or domestic trucking are not a breach of this Agreement if Seller keeps Buyer reasonably informed of the status.</w:t>
+        <w:t>Seller is a reseller, not the manufacturer. Cabinets come as ready-to-assemble flat packs, shipped to Cañon City, Colorado. Most items are available from warehouses in the United States. Custom or out-of-stock orders may take longer because some products originate overseas. Lead times are estimates. Delays in manufacturing, freight, or trucking are not a breach of this Agreement if Seller keeps Buyer reasonably informed.</w:t>
       </w:r>
     </w:p>
     <w:p>
@@ -323,7 +323,7 @@
           <w:color w:val="222222"/>
           <w:sz w:val="22"/>
         </w:rPr>
-        <w:t>Payment is firm because Seller must pay its vendor 100% up front and has no vendor billing terms. Seller is floating the cash.</w:t>
+        <w:t>Here is how payment works.</w:t>
       </w:r>
     </w:p>
     <w:p>
@@ -386,7 +386,7 @@
           <w:color w:val="222222"/>
           <w:sz w:val="22"/>
         </w:rPr>
-        <w:t>Together these equal 100%. No Goods leave Seller's premises (pickup or delivery) until paid in full. Late payment allows Seller to pause the order. Buyer is responsible for returned-payment fees and reasonable collection costs. Colorado sales tax applies as required by law.</w:t>
+        <w:t>Together these equal 100%. No Goods leave Seller, whether by pickup or delivery, until paid in full. If a payment is late, Seller may pause the order until it is current. Colorado sales tax applies as required by law.</w:t>
       </w:r>
     </w:p>
     <w:p>

</xml_diff>

<commit_message>
Add manufacturer elevations to Fremont Makers sales agreement.
Buyer must verify elevations against the job. Misfit after order is Buyer cost.
</commit_message>
<xml_diff>
--- a/assets/fremont-makers-sales-agreement.docx
+++ b/assets/fremont-makers-sales-agreement.docx
@@ -191,7 +191,7 @@
           <w:color w:val="222222"/>
           <w:sz w:val="22"/>
         </w:rPr>
-        <w:t>This Agreement plus Seller's written Quote and/or Invoice together form the entire deal. The Quote and Invoice are incorporated by reference. Dollar amounts appear only on the Quote or Invoice. Pricing is by bid. This form is the terms.</w:t>
+        <w:t>This Agreement plus Seller's written Quote and/or Invoice together form the entire deal. The Quote and Invoice are incorporated by reference. Dollar amounts appear only on the Quote or Invoice. Pricing is by bid. This form is the terms. The Quote package also includes manufacturer elevation views with measurements.</w:t>
       </w:r>
     </w:p>
     <w:p>
@@ -404,7 +404,7 @@
           <w:color w:val="1A2E3B"/>
           <w:sz w:val="26"/>
         </w:rPr>
-        <w:t>7. Measurements and Specifications</w:t>
+        <w:t>7. Measurements and Elevations</w:t>
       </w:r>
     </w:p>
     <w:p>
@@ -419,7 +419,7 @@
           <w:color w:val="222222"/>
           <w:sz w:val="22"/>
         </w:rPr>
-        <w:t>Buyer is solely responsible for all measurements, quantities, layouts, and specifications. Seller is not liable if Buyer's measurements or specifications are incorrect. Wrong sizes, missing fillers, incorrect appliance openings, or similar issues are Buyer's cost to correct, including any reorder, restocking, or freight charges. Seller may review drawings as a courtesy only. Such review is not a warranty that the Goods will fit.</w:t>
+        <w:t>Buyer is responsible for all measurements, quantities, layouts, and specifications. Seller is not liable if those are incorrect. Wrong sizes, missing fillers, appliance openings that do not match, or similar problems are Buyer's cost to correct, including reorder, restocking, and freight. Seller passes along manufacturer elevation views with measurements as part of the Quote. Buyer must verify those elevations and measurements against the job site. Buyer owns that check. Providing the elevations does not make Seller the designer, the measurer, or a warrantor that the layout will fit. If Buyer orders from those elevations without catching an error, Seller is not liable for the misfit.</w:t>
       </w:r>
     </w:p>
     <w:p>

</xml_diff>

<commit_message>
Brand Fremont Makers sales agreement and add dashboard card.
Screen page uses FM Playfair / Pinyon / black-cream. Word copy drops Unbridled blue. Hub card lives next to Quote Builder.
</commit_message>
<xml_diff>
--- a/assets/fremont-makers-sales-agreement.docx
+++ b/assets/fremont-makers-sales-agreement.docx
@@ -5,14 +5,16 @@
     <w:p>
       <w:pPr>
         <w:spacing w:before="0" w:after="40" w:line="240" w:lineRule="auto"/>
+        <w:jc w:val="center"/>
       </w:pPr>
       <w:r>
         <w:rPr>
-          <w:rFonts w:ascii="Calibri" w:hAnsi="Calibri"/>
+          <w:rFonts w:ascii="Georgia" w:hAnsi="Georgia" w:cs="Georgia"/>
           <w:b/>
           <w:i w:val="0"/>
-          <w:color w:val="5A8BA7"/>
-          <w:sz w:val="20"/>
+          <w:caps/>
+          <w:color w:val="1A1A1A"/>
+          <w:sz w:val="32"/>
         </w:rPr>
         <w:t>FREMONT MAKERS LLC</w:t>
       </w:r>
@@ -20,13 +22,32 @@
     <w:p>
       <w:pPr>
         <w:spacing w:before="0" w:after="40" w:line="240" w:lineRule="auto"/>
+        <w:jc w:val="center"/>
       </w:pPr>
       <w:r>
         <w:rPr>
-          <w:rFonts w:ascii="Calibri" w:hAnsi="Calibri"/>
+          <w:rFonts w:ascii="Georgia" w:hAnsi="Georgia" w:cs="Georgia"/>
+          <w:b w:val="0"/>
+          <w:i/>
+          <w:caps w:val="0"/>
+          <w:color w:val="4B4F54"/>
+          <w:sz w:val="24"/>
+        </w:rPr>
+        <w:t>making freedom</w:t>
+      </w:r>
+    </w:p>
+    <w:p>
+      <w:pPr>
+        <w:spacing w:before="0" w:after="40" w:line="240" w:lineRule="auto"/>
+        <w:jc w:val="center"/>
+      </w:pPr>
+      <w:r>
+        <w:rPr>
+          <w:rFonts w:ascii="Georgia" w:hAnsi="Georgia" w:cs="Georgia"/>
           <w:b/>
           <w:i w:val="0"/>
-          <w:color w:val="1A2E3B"/>
+          <w:caps w:val="0"/>
+          <w:color w:val="1A1A1A"/>
           <w:sz w:val="44"/>
         </w:rPr>
         <w:t>Customer Sales Agreement</w:t>
@@ -36,16 +57,17 @@
       <w:pPr>
         <w:spacing w:before="0" w:after="240" w:line="240" w:lineRule="auto"/>
         <w:pBdr>
-          <w:bottom w:val="single" w:sz="18" w:space="4" w:color="5a8ba7"/>
+          <w:bottom w:val="single" w:sz="18" w:space="4" w:color="1A1A1A"/>
         </w:pBdr>
+        <w:jc w:val="center"/>
       </w:pPr>
       <w:r>
         <w:rPr>
-          <w:rFonts w:ascii="Calibri" w:hAnsi="Calibri"/>
+          <w:rFonts w:ascii="Calibri" w:hAnsi="Calibri" w:cs="Calibri"/>
           <w:b w:val="0"/>
-          <w:i/>
+          <w:i w:val="0"/>
           <w:color w:val="4B4F54"/>
-          <w:sz w:val="22"/>
+          <w:sz w:val="20"/>
         </w:rPr>
         <w:t>Terms and Conditions  ·  Ready-to-Assemble Cabinets  ·  DRAFT  ·  September 2, 2026</w:t>
       </w:r>
@@ -54,15 +76,15 @@
       <w:pPr>
         <w:spacing w:before="280" w:after="120" w:line="240" w:lineRule="auto"/>
         <w:pBdr>
-          <w:bottom w:val="single" w:sz="12" w:space="4" w:color="5a8ba7"/>
+          <w:bottom w:val="single" w:sz="12" w:space="4" w:color="1A1A1A"/>
         </w:pBdr>
       </w:pPr>
       <w:r>
         <w:rPr>
-          <w:rFonts w:ascii="Calibri" w:hAnsi="Calibri"/>
+          <w:rFonts w:ascii="Georgia" w:hAnsi="Georgia" w:cs="Georgia"/>
           <w:b/>
           <w:i w:val="0"/>
-          <w:color w:val="1A2E3B"/>
+          <w:color w:val="1A1A1A"/>
           <w:sz w:val="26"/>
         </w:rPr>
         <w:t>Attorney review required</w:t>
@@ -74,11 +96,11 @@
       </w:pPr>
       <w:r>
         <w:rPr>
-          <w:rFonts w:ascii="Calibri" w:hAnsi="Calibri"/>
+          <w:rFonts w:ascii="Calibri" w:hAnsi="Calibri" w:cs="Calibri"/>
           <w:b w:val="0"/>
           <w:i/>
-          <w:color w:val="222222"/>
-          <w:sz w:val="20"/>
+          <w:color w:val="1A1A1A"/>
+          <w:sz w:val="22"/>
         </w:rPr>
         <w:t>This document was drafted by an AI legal agent as a starting point. It has not been reviewed by a licensed attorney. Before signing or distributing this document, it must be reviewed by a qualified attorney licensed in Colorado. Unbridled Solutions and MC make no representation that this document is legally sufficient or enforceable.</w:t>
       </w:r>
@@ -87,15 +109,15 @@
       <w:pPr>
         <w:spacing w:before="280" w:after="120" w:line="240" w:lineRule="auto"/>
         <w:pBdr>
-          <w:bottom w:val="single" w:sz="12" w:space="4" w:color="5a8ba7"/>
+          <w:bottom w:val="single" w:sz="12" w:space="4" w:color="1A1A1A"/>
         </w:pBdr>
       </w:pPr>
       <w:r>
         <w:rPr>
-          <w:rFonts w:ascii="Calibri" w:hAnsi="Calibri"/>
+          <w:rFonts w:ascii="Georgia" w:hAnsi="Georgia" w:cs="Georgia"/>
           <w:b/>
           <w:i w:val="0"/>
-          <w:color w:val="1A2E3B"/>
+          <w:color w:val="1A1A1A"/>
           <w:sz w:val="26"/>
         </w:rPr>
         <w:t>1. Parties and Effective Date</w:t>
@@ -107,10 +129,10 @@
       </w:pPr>
       <w:r>
         <w:rPr>
-          <w:rFonts w:ascii="Calibri" w:hAnsi="Calibri"/>
+          <w:rFonts w:ascii="Calibri" w:hAnsi="Calibri" w:cs="Calibri"/>
           <w:b w:val="0"/>
           <w:i w:val="0"/>
-          <w:color w:val="222222"/>
+          <w:color w:val="1A1A1A"/>
           <w:sz w:val="22"/>
         </w:rPr>
         <w:t>1.1 Seller: Fremont Makers LLC, a Colorado limited liability company, located at 719 Main Street, Cañon City, CO 81212.</w:t>
@@ -122,10 +144,10 @@
       </w:pPr>
       <w:r>
         <w:rPr>
-          <w:rFonts w:ascii="Calibri" w:hAnsi="Calibri"/>
+          <w:rFonts w:ascii="Calibri" w:hAnsi="Calibri" w:cs="Calibri"/>
           <w:b w:val="0"/>
           <w:i w:val="0"/>
-          <w:color w:val="222222"/>
+          <w:color w:val="1A1A1A"/>
           <w:sz w:val="22"/>
         </w:rPr>
         <w:t>1.2 Buyer: ________________________________  Address: ________________________________</w:t>
@@ -137,10 +159,10 @@
       </w:pPr>
       <w:r>
         <w:rPr>
-          <w:rFonts w:ascii="Calibri" w:hAnsi="Calibri"/>
+          <w:rFonts w:ascii="Calibri" w:hAnsi="Calibri" w:cs="Calibri"/>
           <w:b w:val="0"/>
           <w:i w:val="0"/>
-          <w:color w:val="222222"/>
+          <w:color w:val="1A1A1A"/>
           <w:sz w:val="22"/>
         </w:rPr>
         <w:t>Phone: ________________  Email: ________________  Job / site address: ________________</w:t>
@@ -152,10 +174,10 @@
       </w:pPr>
       <w:r>
         <w:rPr>
-          <w:rFonts w:ascii="Calibri" w:hAnsi="Calibri"/>
+          <w:rFonts w:ascii="Calibri" w:hAnsi="Calibri" w:cs="Calibri"/>
           <w:b w:val="0"/>
           <w:i w:val="0"/>
-          <w:color w:val="222222"/>
+          <w:color w:val="1A1A1A"/>
           <w:sz w:val="22"/>
         </w:rPr>
         <w:t>1.3 Effective Date: the date of the last signature below, or the date of the Quote, whichever is later.</w:t>
@@ -165,15 +187,15 @@
       <w:pPr>
         <w:spacing w:before="280" w:after="120" w:line="240" w:lineRule="auto"/>
         <w:pBdr>
-          <w:bottom w:val="single" w:sz="12" w:space="4" w:color="5a8ba7"/>
+          <w:bottom w:val="single" w:sz="12" w:space="4" w:color="1A1A1A"/>
         </w:pBdr>
       </w:pPr>
       <w:r>
         <w:rPr>
-          <w:rFonts w:ascii="Calibri" w:hAnsi="Calibri"/>
+          <w:rFonts w:ascii="Georgia" w:hAnsi="Georgia" w:cs="Georgia"/>
           <w:b/>
           <w:i w:val="0"/>
-          <w:color w:val="1A2E3B"/>
+          <w:color w:val="1A1A1A"/>
           <w:sz w:val="26"/>
         </w:rPr>
         <w:t>2. What This Agreement Covers</w:t>
@@ -185,10 +207,10 @@
       </w:pPr>
       <w:r>
         <w:rPr>
-          <w:rFonts w:ascii="Calibri" w:hAnsi="Calibri"/>
+          <w:rFonts w:ascii="Calibri" w:hAnsi="Calibri" w:cs="Calibri"/>
           <w:b w:val="0"/>
           <w:i w:val="0"/>
-          <w:color w:val="222222"/>
+          <w:color w:val="1A1A1A"/>
           <w:sz w:val="22"/>
         </w:rPr>
         <w:t>This Agreement plus Seller's written Quote and/or Invoice together form the entire deal. The Quote and Invoice are incorporated by reference. Dollar amounts appear only on the Quote or Invoice. Pricing is by bid. This form is the terms. The Quote package also includes manufacturer elevation views with measurements.</w:t>
@@ -198,15 +220,15 @@
       <w:pPr>
         <w:spacing w:before="280" w:after="120" w:line="240" w:lineRule="auto"/>
         <w:pBdr>
-          <w:bottom w:val="single" w:sz="12" w:space="4" w:color="5a8ba7"/>
+          <w:bottom w:val="single" w:sz="12" w:space="4" w:color="1A1A1A"/>
         </w:pBdr>
       </w:pPr>
       <w:r>
         <w:rPr>
-          <w:rFonts w:ascii="Calibri" w:hAnsi="Calibri"/>
+          <w:rFonts w:ascii="Georgia" w:hAnsi="Georgia" w:cs="Georgia"/>
           <w:b/>
           <w:i w:val="0"/>
-          <w:color w:val="1A2E3B"/>
+          <w:color w:val="1A1A1A"/>
           <w:sz w:val="26"/>
         </w:rPr>
         <w:t>3. What Seller Sells</w:t>
@@ -218,10 +240,10 @@
       </w:pPr>
       <w:r>
         <w:rPr>
-          <w:rFonts w:ascii="Calibri" w:hAnsi="Calibri"/>
+          <w:rFonts w:ascii="Calibri" w:hAnsi="Calibri" w:cs="Calibri"/>
           <w:b w:val="0"/>
           <w:i w:val="0"/>
-          <w:color w:val="222222"/>
+          <w:color w:val="1A1A1A"/>
           <w:sz w:val="22"/>
         </w:rPr>
         <w:t>Seller sells ready-to-assemble (RTA / flat-pack) cabinets and related hardware listed on the Quote or Invoice. Unless the Quote states otherwise in writing, Seller does not provide design professional services, field measuring, installation, plumbing, electrical work, countertops, or appliances.</w:t>
@@ -231,15 +253,15 @@
       <w:pPr>
         <w:spacing w:before="280" w:after="120" w:line="240" w:lineRule="auto"/>
         <w:pBdr>
-          <w:bottom w:val="single" w:sz="12" w:space="4" w:color="5a8ba7"/>
+          <w:bottom w:val="single" w:sz="12" w:space="4" w:color="1A1A1A"/>
         </w:pBdr>
       </w:pPr>
       <w:r>
         <w:rPr>
-          <w:rFonts w:ascii="Calibri" w:hAnsi="Calibri"/>
+          <w:rFonts w:ascii="Georgia" w:hAnsi="Georgia" w:cs="Georgia"/>
           <w:b/>
           <w:i w:val="0"/>
-          <w:color w:val="1A2E3B"/>
+          <w:color w:val="1A1A1A"/>
           <w:sz w:val="26"/>
         </w:rPr>
         <w:t>4. Reseller and Origin</w:t>
@@ -251,10 +273,10 @@
       </w:pPr>
       <w:r>
         <w:rPr>
-          <w:rFonts w:ascii="Calibri" w:hAnsi="Calibri"/>
+          <w:rFonts w:ascii="Calibri" w:hAnsi="Calibri" w:cs="Calibri"/>
           <w:b w:val="0"/>
           <w:i w:val="0"/>
-          <w:color w:val="222222"/>
+          <w:color w:val="1A1A1A"/>
           <w:sz w:val="22"/>
         </w:rPr>
         <w:t>Seller is a reseller, not the manufacturer. Cabinets come as ready-to-assemble flat packs, shipped to Cañon City, Colorado. Most items are available from warehouses in the United States. Custom or out-of-stock orders may take longer because some products originate overseas. Lead times are estimates. Delays in manufacturing, freight, or trucking are not a breach of this Agreement if Seller keeps Buyer reasonably informed.</w:t>
@@ -264,15 +286,15 @@
       <w:pPr>
         <w:spacing w:before="280" w:after="120" w:line="240" w:lineRule="auto"/>
         <w:pBdr>
-          <w:bottom w:val="single" w:sz="12" w:space="4" w:color="5a8ba7"/>
+          <w:bottom w:val="single" w:sz="12" w:space="4" w:color="1A1A1A"/>
         </w:pBdr>
       </w:pPr>
       <w:r>
         <w:rPr>
-          <w:rFonts w:ascii="Calibri" w:hAnsi="Calibri"/>
+          <w:rFonts w:ascii="Georgia" w:hAnsi="Georgia" w:cs="Georgia"/>
           <w:b/>
           <w:i w:val="0"/>
-          <w:color w:val="1A2E3B"/>
+          <w:color w:val="1A1A1A"/>
           <w:sz w:val="26"/>
         </w:rPr>
         <w:t>5. Quote, Invoice, and Changes</w:t>
@@ -284,10 +306,10 @@
       </w:pPr>
       <w:r>
         <w:rPr>
-          <w:rFonts w:ascii="Calibri" w:hAnsi="Calibri"/>
+          <w:rFonts w:ascii="Calibri" w:hAnsi="Calibri" w:cs="Calibri"/>
           <w:b w:val="0"/>
           <w:i w:val="0"/>
-          <w:color w:val="222222"/>
+          <w:color w:val="1A1A1A"/>
           <w:sz w:val="22"/>
         </w:rPr>
         <w:t>If the Quote and Invoice conflict, the Invoice controls price after Buyer approval. This Agreement controls all other terms. Changes are valid only if made in a written change order signed by both parties. If manufacturer price increases, tariffs, or extra freight occur after the Quote but before the factory order is placed, Seller may revise the Quote before the 50% payment is accepted. After the factory order is placed, Buyer pays documented extras only if Buyer approved the change in writing.</w:t>
@@ -297,15 +319,15 @@
       <w:pPr>
         <w:spacing w:before="280" w:after="120" w:line="240" w:lineRule="auto"/>
         <w:pBdr>
-          <w:bottom w:val="single" w:sz="12" w:space="4" w:color="5a8ba7"/>
+          <w:bottom w:val="single" w:sz="12" w:space="4" w:color="1A1A1A"/>
         </w:pBdr>
       </w:pPr>
       <w:r>
         <w:rPr>
-          <w:rFonts w:ascii="Calibri" w:hAnsi="Calibri"/>
+          <w:rFonts w:ascii="Georgia" w:hAnsi="Georgia" w:cs="Georgia"/>
           <w:b/>
           <w:i w:val="0"/>
-          <w:color w:val="1A2E3B"/>
+          <w:color w:val="1A1A1A"/>
           <w:sz w:val="26"/>
         </w:rPr>
         <w:t>6. Payment Schedule</w:t>
@@ -317,10 +339,10 @@
       </w:pPr>
       <w:r>
         <w:rPr>
-          <w:rFonts w:ascii="Calibri" w:hAnsi="Calibri"/>
+          <w:rFonts w:ascii="Calibri" w:hAnsi="Calibri" w:cs="Calibri"/>
           <w:b w:val="0"/>
           <w:i w:val="0"/>
-          <w:color w:val="222222"/>
+          <w:color w:val="1A1A1A"/>
           <w:sz w:val="22"/>
         </w:rPr>
         <w:t>Here is how payment works.</w:t>
@@ -333,10 +355,10 @@
       </w:pPr>
       <w:r>
         <w:rPr>
-          <w:rFonts w:ascii="Calibri" w:hAnsi="Calibri"/>
+          <w:rFonts w:ascii="Calibri" w:hAnsi="Calibri" w:cs="Calibri"/>
           <w:b w:val="0"/>
           <w:i w:val="0"/>
-          <w:color w:val="222222"/>
+          <w:color w:val="1A1A1A"/>
           <w:sz w:val="22"/>
         </w:rPr>
         <w:t>50% of the Invoice total is due to place the order. This amount is non-refundable once Seller has placed the factory order, except as required by law.</w:t>
@@ -349,10 +371,10 @@
       </w:pPr>
       <w:r>
         <w:rPr>
-          <w:rFonts w:ascii="Calibri" w:hAnsi="Calibri"/>
+          <w:rFonts w:ascii="Calibri" w:hAnsi="Calibri" w:cs="Calibri"/>
           <w:b w:val="0"/>
           <w:i w:val="0"/>
-          <w:color w:val="222222"/>
+          <w:color w:val="1A1A1A"/>
           <w:sz w:val="22"/>
         </w:rPr>
         <w:t>30% of the Invoice total is due when the order lands in Cañon City, Colorado.</w:t>
@@ -365,10 +387,10 @@
       </w:pPr>
       <w:r>
         <w:rPr>
-          <w:rFonts w:ascii="Calibri" w:hAnsi="Calibri"/>
+          <w:rFonts w:ascii="Calibri" w:hAnsi="Calibri" w:cs="Calibri"/>
           <w:b w:val="0"/>
           <w:i w:val="0"/>
-          <w:color w:val="222222"/>
+          <w:color w:val="1A1A1A"/>
           <w:sz w:val="22"/>
         </w:rPr>
         <w:t>20% of the Invoice total is due on pickup or delivery.</w:t>
@@ -380,10 +402,10 @@
       </w:pPr>
       <w:r>
         <w:rPr>
-          <w:rFonts w:ascii="Calibri" w:hAnsi="Calibri"/>
+          <w:rFonts w:ascii="Calibri" w:hAnsi="Calibri" w:cs="Calibri"/>
           <w:b w:val="0"/>
           <w:i w:val="0"/>
-          <w:color w:val="222222"/>
+          <w:color w:val="1A1A1A"/>
           <w:sz w:val="22"/>
         </w:rPr>
         <w:t>Together these equal 100%. No Goods leave Seller, whether by pickup or delivery, until paid in full. If a payment is late, Seller may pause the order until it is current. Colorado sales tax applies as required by law.</w:t>
@@ -393,15 +415,15 @@
       <w:pPr>
         <w:spacing w:before="280" w:after="120" w:line="240" w:lineRule="auto"/>
         <w:pBdr>
-          <w:bottom w:val="single" w:sz="12" w:space="4" w:color="5a8ba7"/>
+          <w:bottom w:val="single" w:sz="12" w:space="4" w:color="1A1A1A"/>
         </w:pBdr>
       </w:pPr>
       <w:r>
         <w:rPr>
-          <w:rFonts w:ascii="Calibri" w:hAnsi="Calibri"/>
+          <w:rFonts w:ascii="Georgia" w:hAnsi="Georgia" w:cs="Georgia"/>
           <w:b/>
           <w:i w:val="0"/>
-          <w:color w:val="1A2E3B"/>
+          <w:color w:val="1A1A1A"/>
           <w:sz w:val="26"/>
         </w:rPr>
         <w:t>7. Measurements and Elevations</w:t>
@@ -413,10 +435,10 @@
       </w:pPr>
       <w:r>
         <w:rPr>
-          <w:rFonts w:ascii="Calibri" w:hAnsi="Calibri"/>
+          <w:rFonts w:ascii="Calibri" w:hAnsi="Calibri" w:cs="Calibri"/>
           <w:b w:val="0"/>
           <w:i w:val="0"/>
-          <w:color w:val="222222"/>
+          <w:color w:val="1A1A1A"/>
           <w:sz w:val="22"/>
         </w:rPr>
         <w:t>Buyer is responsible for all measurements, quantities, layouts, and specifications. Seller is not liable if those are incorrect. Wrong sizes, missing fillers, appliance openings that do not match, or similar problems are Buyer's cost to correct, including reorder, restocking, and freight. Seller passes along manufacturer elevation views with measurements as part of the Quote. Buyer must verify those elevations and measurements against the job site. Buyer owns that check. Providing the elevations does not make Seller the designer, the measurer, or a warrantor that the layout will fit. If Buyer orders from those elevations without catching an error, Seller is not liable for the misfit.</w:t>
@@ -426,15 +448,15 @@
       <w:pPr>
         <w:spacing w:before="280" w:after="120" w:line="240" w:lineRule="auto"/>
         <w:pBdr>
-          <w:bottom w:val="single" w:sz="12" w:space="4" w:color="5a8ba7"/>
+          <w:bottom w:val="single" w:sz="12" w:space="4" w:color="1A1A1A"/>
         </w:pBdr>
       </w:pPr>
       <w:r>
         <w:rPr>
-          <w:rFonts w:ascii="Calibri" w:hAnsi="Calibri"/>
+          <w:rFonts w:ascii="Georgia" w:hAnsi="Georgia" w:cs="Georgia"/>
           <w:b/>
           <w:i w:val="0"/>
-          <w:color w:val="1A2E3B"/>
+          <w:color w:val="1A1A1A"/>
           <w:sz w:val="26"/>
         </w:rPr>
         <w:t>8. Cancellation and Returns</w:t>
@@ -446,10 +468,10 @@
       </w:pPr>
       <w:r>
         <w:rPr>
-          <w:rFonts w:ascii="Calibri" w:hAnsi="Calibri"/>
+          <w:rFonts w:ascii="Calibri" w:hAnsi="Calibri" w:cs="Calibri"/>
           <w:b w:val="0"/>
           <w:i w:val="0"/>
-          <w:color w:val="222222"/>
+          <w:color w:val="1A1A1A"/>
           <w:sz w:val="22"/>
         </w:rPr>
         <w:t>Once the factory order is placed, special-order RTA cabinets are generally not returnable. If cancellation is allowed at all, the deposit will be applied to restocking, freight, and factory charges. Unused stock hardware may be returned only if Seller agrees in writing in advance.</w:t>
@@ -459,15 +481,15 @@
       <w:pPr>
         <w:spacing w:before="280" w:after="120" w:line="240" w:lineRule="auto"/>
         <w:pBdr>
-          <w:bottom w:val="single" w:sz="12" w:space="4" w:color="5a8ba7"/>
+          <w:bottom w:val="single" w:sz="12" w:space="4" w:color="1A1A1A"/>
         </w:pBdr>
       </w:pPr>
       <w:r>
         <w:rPr>
-          <w:rFonts w:ascii="Calibri" w:hAnsi="Calibri"/>
+          <w:rFonts w:ascii="Georgia" w:hAnsi="Georgia" w:cs="Georgia"/>
           <w:b/>
           <w:i w:val="0"/>
-          <w:color w:val="1A2E3B"/>
+          <w:color w:val="1A1A1A"/>
           <w:sz w:val="26"/>
         </w:rPr>
         <w:t>9. Delivery, Pickup, and Inspection</w:t>
@@ -479,10 +501,10 @@
       </w:pPr>
       <w:r>
         <w:rPr>
-          <w:rFonts w:ascii="Calibri" w:hAnsi="Calibri"/>
+          <w:rFonts w:ascii="Calibri" w:hAnsi="Calibri" w:cs="Calibri"/>
           <w:b w:val="0"/>
           <w:i w:val="0"/>
-          <w:color w:val="222222"/>
+          <w:color w:val="1A1A1A"/>
           <w:sz w:val="22"/>
         </w:rPr>
         <w:t>Buyer inspects the Goods at pickup or delivery and notes any visible damage on the bill of lading or delivery ticket. Failure to note damage within 48 hours means the Goods are deemed accepted, except for latent defects. Risk of loss passes to Buyer on pickup or on delivery to the site address. Title passes only when Buyer has paid in full.</w:t>
@@ -492,15 +514,15 @@
       <w:pPr>
         <w:spacing w:before="280" w:after="120" w:line="240" w:lineRule="auto"/>
         <w:pBdr>
-          <w:bottom w:val="single" w:sz="12" w:space="4" w:color="5a8ba7"/>
+          <w:bottom w:val="single" w:sz="12" w:space="4" w:color="1A1A1A"/>
         </w:pBdr>
       </w:pPr>
       <w:r>
         <w:rPr>
-          <w:rFonts w:ascii="Calibri" w:hAnsi="Calibri"/>
+          <w:rFonts w:ascii="Georgia" w:hAnsi="Georgia" w:cs="Georgia"/>
           <w:b/>
           <w:i w:val="0"/>
-          <w:color w:val="1A2E3B"/>
+          <w:color w:val="1A1A1A"/>
           <w:sz w:val="26"/>
         </w:rPr>
         <w:t>10. Assembly</w:t>
@@ -512,10 +534,10 @@
       </w:pPr>
       <w:r>
         <w:rPr>
-          <w:rFonts w:ascii="Calibri" w:hAnsi="Calibri"/>
+          <w:rFonts w:ascii="Calibri" w:hAnsi="Calibri" w:cs="Calibri"/>
           <w:b w:val="0"/>
           <w:i w:val="0"/>
-          <w:color w:val="222222"/>
+          <w:color w:val="1A1A1A"/>
           <w:sz w:val="22"/>
         </w:rPr>
         <w:t>The Goods are flat-pack. Assembly is by Buyer or Buyer's contractor unless the Quote expressly includes Seller assembly. If Seller assembly is included, it covers assembly only and does not include installation into the building.</w:t>
@@ -525,15 +547,15 @@
       <w:pPr>
         <w:spacing w:before="280" w:after="120" w:line="240" w:lineRule="auto"/>
         <w:pBdr>
-          <w:bottom w:val="single" w:sz="12" w:space="4" w:color="5a8ba7"/>
+          <w:bottom w:val="single" w:sz="12" w:space="4" w:color="1A1A1A"/>
         </w:pBdr>
       </w:pPr>
       <w:r>
         <w:rPr>
-          <w:rFonts w:ascii="Calibri" w:hAnsi="Calibri"/>
+          <w:rFonts w:ascii="Georgia" w:hAnsi="Georgia" w:cs="Georgia"/>
           <w:b/>
           <w:i w:val="0"/>
-          <w:color w:val="1A2E3B"/>
+          <w:color w:val="1A1A1A"/>
           <w:sz w:val="26"/>
         </w:rPr>
         <w:t>11. Warranty and Limitation of Liability</w:t>
@@ -545,10 +567,10 @@
       </w:pPr>
       <w:r>
         <w:rPr>
-          <w:rFonts w:ascii="Calibri" w:hAnsi="Calibri"/>
+          <w:rFonts w:ascii="Calibri" w:hAnsi="Calibri" w:cs="Calibri"/>
           <w:b w:val="0"/>
           <w:i w:val="0"/>
-          <w:color w:val="222222"/>
+          <w:color w:val="1A1A1A"/>
           <w:sz w:val="22"/>
         </w:rPr>
         <w:t>Seller passes through any manufacturer warranty that applies to the Goods. Seller warrants it has the right to sell the Goods. Except for that warranty, Seller makes no other warranties. To the extent Colorado law allows, Seller disclaims all implied warranties of merchantability and fitness for a particular purpose. This language is written to cover builders, contractors, and homeowners. A Colorado attorney should confirm treatment under the UCC versus consumer protection rules.</w:t>
@@ -560,10 +582,10 @@
       </w:pPr>
       <w:r>
         <w:rPr>
-          <w:rFonts w:ascii="Calibri" w:hAnsi="Calibri"/>
+          <w:rFonts w:ascii="Calibri" w:hAnsi="Calibri" w:cs="Calibri"/>
           <w:b w:val="0"/>
           <w:i w:val="0"/>
-          <w:color w:val="222222"/>
+          <w:color w:val="1A1A1A"/>
           <w:sz w:val="22"/>
         </w:rPr>
         <w:t>Seller's total liability under this Agreement is limited to the amounts Buyer actually paid for the affected Goods. Seller is not liable for consequential, delay, lost-rent, lost-profit, or similar damages.</w:t>
@@ -573,15 +595,15 @@
       <w:pPr>
         <w:spacing w:before="280" w:after="120" w:line="240" w:lineRule="auto"/>
         <w:pBdr>
-          <w:bottom w:val="single" w:sz="12" w:space="4" w:color="5a8ba7"/>
+          <w:bottom w:val="single" w:sz="12" w:space="4" w:color="1A1A1A"/>
         </w:pBdr>
       </w:pPr>
       <w:r>
         <w:rPr>
-          <w:rFonts w:ascii="Calibri" w:hAnsi="Calibri"/>
+          <w:rFonts w:ascii="Georgia" w:hAnsi="Georgia" w:cs="Georgia"/>
           <w:b/>
           <w:i w:val="0"/>
-          <w:color w:val="1A2E3B"/>
+          <w:color w:val="1A1A1A"/>
           <w:sz w:val="26"/>
         </w:rPr>
         <w:t>12. Events Outside Seller's Control</w:t>
@@ -593,10 +615,10 @@
       </w:pPr>
       <w:r>
         <w:rPr>
-          <w:rFonts w:ascii="Calibri" w:hAnsi="Calibri"/>
+          <w:rFonts w:ascii="Calibri" w:hAnsi="Calibri" w:cs="Calibri"/>
           <w:b w:val="0"/>
           <w:i w:val="0"/>
-          <w:color w:val="222222"/>
+          <w:color w:val="1A1A1A"/>
           <w:sz w:val="22"/>
         </w:rPr>
         <w:t>Seller is not liable for delays or failures caused by events beyond its reasonable control, including factory issues, ocean freight problems, customs delays, weather, labor disputes, or government actions, provided Seller notifies Buyer promptly.</w:t>
@@ -606,15 +628,15 @@
       <w:pPr>
         <w:spacing w:before="280" w:after="120" w:line="240" w:lineRule="auto"/>
         <w:pBdr>
-          <w:bottom w:val="single" w:sz="12" w:space="4" w:color="5a8ba7"/>
+          <w:bottom w:val="single" w:sz="12" w:space="4" w:color="1A1A1A"/>
         </w:pBdr>
       </w:pPr>
       <w:r>
         <w:rPr>
-          <w:rFonts w:ascii="Calibri" w:hAnsi="Calibri"/>
+          <w:rFonts w:ascii="Georgia" w:hAnsi="Georgia" w:cs="Georgia"/>
           <w:b/>
           <w:i w:val="0"/>
-          <w:color w:val="1A2E3B"/>
+          <w:color w:val="1A1A1A"/>
           <w:sz w:val="26"/>
         </w:rPr>
         <w:t>13. Entire Agreement, Severability, Waiver, and Counterparts</w:t>
@@ -626,10 +648,10 @@
       </w:pPr>
       <w:r>
         <w:rPr>
-          <w:rFonts w:ascii="Calibri" w:hAnsi="Calibri"/>
+          <w:rFonts w:ascii="Calibri" w:hAnsi="Calibri" w:cs="Calibri"/>
           <w:b w:val="0"/>
           <w:i w:val="0"/>
-          <w:color w:val="222222"/>
+          <w:color w:val="1A1A1A"/>
           <w:sz w:val="22"/>
         </w:rPr>
         <w:t>This Agreement, together with the Quote and Invoice, is the entire agreement between the parties. It replaces all prior discussions. If any part is found unenforceable, the rest remains in effect. Failure to enforce any term is not a waiver of that term. This Agreement may be signed in counterparts or by electronic signature under the Colorado Uniform Electronic Transactions Act.</w:t>
@@ -639,15 +661,15 @@
       <w:pPr>
         <w:spacing w:before="280" w:after="120" w:line="240" w:lineRule="auto"/>
         <w:pBdr>
-          <w:bottom w:val="single" w:sz="12" w:space="4" w:color="5a8ba7"/>
+          <w:bottom w:val="single" w:sz="12" w:space="4" w:color="1A1A1A"/>
         </w:pBdr>
       </w:pPr>
       <w:r>
         <w:rPr>
-          <w:rFonts w:ascii="Calibri" w:hAnsi="Calibri"/>
+          <w:rFonts w:ascii="Georgia" w:hAnsi="Georgia" w:cs="Georgia"/>
           <w:b/>
           <w:i w:val="0"/>
-          <w:color w:val="1A2E3B"/>
+          <w:color w:val="1A1A1A"/>
           <w:sz w:val="26"/>
         </w:rPr>
         <w:t>14. Governing Law</w:t>
@@ -659,10 +681,10 @@
       </w:pPr>
       <w:r>
         <w:rPr>
-          <w:rFonts w:ascii="Calibri" w:hAnsi="Calibri"/>
+          <w:rFonts w:ascii="Calibri" w:hAnsi="Calibri" w:cs="Calibri"/>
           <w:b w:val="0"/>
           <w:i w:val="0"/>
-          <w:color w:val="222222"/>
+          <w:color w:val="1A1A1A"/>
           <w:sz w:val="22"/>
         </w:rPr>
         <w:t>This Agreement is governed by the laws of the State of Colorado, without regard to conflict-of-laws rules.</w:t>
@@ -672,15 +694,15 @@
       <w:pPr>
         <w:spacing w:before="280" w:after="120" w:line="240" w:lineRule="auto"/>
         <w:pBdr>
-          <w:bottom w:val="single" w:sz="12" w:space="4" w:color="5a8ba7"/>
+          <w:bottom w:val="single" w:sz="12" w:space="4" w:color="1A1A1A"/>
         </w:pBdr>
       </w:pPr>
       <w:r>
         <w:rPr>
-          <w:rFonts w:ascii="Calibri" w:hAnsi="Calibri"/>
+          <w:rFonts w:ascii="Georgia" w:hAnsi="Georgia" w:cs="Georgia"/>
           <w:b/>
           <w:i w:val="0"/>
-          <w:color w:val="1A2E3B"/>
+          <w:color w:val="1A1A1A"/>
           <w:sz w:val="26"/>
         </w:rPr>
         <w:t>15. Disputes and Arbitration</w:t>
@@ -692,10 +714,10 @@
       </w:pPr>
       <w:r>
         <w:rPr>
-          <w:rFonts w:ascii="Calibri" w:hAnsi="Calibri"/>
+          <w:rFonts w:ascii="Calibri" w:hAnsi="Calibri" w:cs="Calibri"/>
           <w:b w:val="0"/>
           <w:i w:val="0"/>
-          <w:color w:val="222222"/>
+          <w:color w:val="1A1A1A"/>
           <w:sz w:val="22"/>
         </w:rPr>
         <w:t>Any dispute arising under this Agreement will be resolved by binding arbitration in Fremont County, Colorado, under the Colorado Uniform Arbitration Act (C.R.S. § 13-22-201 et seq.). One arbitrator will hear the matter. Each side pays its own attorney fees unless the arbitrator awards otherwise. Either party may bring a claim in small claims court if the amount is within that court's limit. If arbitration is unavailable for any reason, venue is in the state courts of Fremont County, Colorado.</w:t>
@@ -705,15 +727,15 @@
       <w:pPr>
         <w:spacing w:before="280" w:after="120" w:line="240" w:lineRule="auto"/>
         <w:pBdr>
-          <w:bottom w:val="single" w:sz="12" w:space="4" w:color="5a8ba7"/>
+          <w:bottom w:val="single" w:sz="12" w:space="4" w:color="1A1A1A"/>
         </w:pBdr>
       </w:pPr>
       <w:r>
         <w:rPr>
-          <w:rFonts w:ascii="Calibri" w:hAnsi="Calibri"/>
+          <w:rFonts w:ascii="Georgia" w:hAnsi="Georgia" w:cs="Georgia"/>
           <w:b/>
           <w:i w:val="0"/>
-          <w:color w:val="1A2E3B"/>
+          <w:color w:val="1A1A1A"/>
           <w:sz w:val="26"/>
         </w:rPr>
         <w:t>16. Signatures</w:t>
@@ -725,10 +747,10 @@
       </w:pPr>
       <w:r>
         <w:rPr>
-          <w:rFonts w:ascii="Calibri" w:hAnsi="Calibri"/>
+          <w:rFonts w:ascii="Calibri" w:hAnsi="Calibri" w:cs="Calibri"/>
           <w:b w:val="0"/>
           <w:i w:val="0"/>
-          <w:color w:val="222222"/>
+          <w:color w:val="1A1A1A"/>
           <w:sz w:val="22"/>
         </w:rPr>
         <w:t>Seller: Fremont Makers LLC</w:t>
@@ -740,10 +762,10 @@
       </w:pPr>
       <w:r>
         <w:rPr>
-          <w:rFonts w:ascii="Calibri" w:hAnsi="Calibri"/>
+          <w:rFonts w:ascii="Calibri" w:hAnsi="Calibri" w:cs="Calibri"/>
           <w:b w:val="0"/>
           <w:i w:val="0"/>
-          <w:color w:val="222222"/>
+          <w:color w:val="1A1A1A"/>
           <w:sz w:val="22"/>
         </w:rPr>
         <w:t>Signature  ________________________________</w:t>
@@ -755,10 +777,10 @@
       </w:pPr>
       <w:r>
         <w:rPr>
-          <w:rFonts w:ascii="Calibri" w:hAnsi="Calibri"/>
+          <w:rFonts w:ascii="Calibri" w:hAnsi="Calibri" w:cs="Calibri"/>
           <w:b w:val="0"/>
           <w:i w:val="0"/>
-          <w:color w:val="222222"/>
+          <w:color w:val="1A1A1A"/>
           <w:sz w:val="22"/>
         </w:rPr>
         <w:t>Printed name  ________________________________</w:t>
@@ -770,10 +792,10 @@
       </w:pPr>
       <w:r>
         <w:rPr>
-          <w:rFonts w:ascii="Calibri" w:hAnsi="Calibri"/>
+          <w:rFonts w:ascii="Calibri" w:hAnsi="Calibri" w:cs="Calibri"/>
           <w:b w:val="0"/>
           <w:i w:val="0"/>
-          <w:color w:val="222222"/>
+          <w:color w:val="1A1A1A"/>
           <w:sz w:val="22"/>
         </w:rPr>
         <w:t>Title  ________________________________</w:t>
@@ -785,10 +807,10 @@
       </w:pPr>
       <w:r>
         <w:rPr>
-          <w:rFonts w:ascii="Calibri" w:hAnsi="Calibri"/>
+          <w:rFonts w:ascii="Calibri" w:hAnsi="Calibri" w:cs="Calibri"/>
           <w:b w:val="0"/>
           <w:i w:val="0"/>
-          <w:color w:val="222222"/>
+          <w:color w:val="1A1A1A"/>
           <w:sz w:val="22"/>
         </w:rPr>
         <w:t>Date  ________________________________</w:t>
@@ -800,10 +822,10 @@
       </w:pPr>
       <w:r>
         <w:rPr>
-          <w:rFonts w:ascii="Calibri" w:hAnsi="Calibri"/>
+          <w:rFonts w:ascii="Calibri" w:hAnsi="Calibri" w:cs="Calibri"/>
           <w:b/>
           <w:i w:val="0"/>
-          <w:color w:val="1A2E3B"/>
+          <w:color w:val="1A1A1A"/>
           <w:sz w:val="22"/>
         </w:rPr>
         <w:t>Buyer</w:t>
@@ -815,10 +837,10 @@
       </w:pPr>
       <w:r>
         <w:rPr>
-          <w:rFonts w:ascii="Calibri" w:hAnsi="Calibri"/>
+          <w:rFonts w:ascii="Calibri" w:hAnsi="Calibri" w:cs="Calibri"/>
           <w:b w:val="0"/>
           <w:i w:val="0"/>
-          <w:color w:val="222222"/>
+          <w:color w:val="1A1A1A"/>
           <w:sz w:val="22"/>
         </w:rPr>
         <w:t>Signature  ________________________________</w:t>
@@ -830,10 +852,10 @@
       </w:pPr>
       <w:r>
         <w:rPr>
-          <w:rFonts w:ascii="Calibri" w:hAnsi="Calibri"/>
+          <w:rFonts w:ascii="Calibri" w:hAnsi="Calibri" w:cs="Calibri"/>
           <w:b w:val="0"/>
           <w:i w:val="0"/>
-          <w:color w:val="222222"/>
+          <w:color w:val="1A1A1A"/>
           <w:sz w:val="22"/>
         </w:rPr>
         <w:t>Printed name  ________________________________</w:t>
@@ -845,10 +867,10 @@
       </w:pPr>
       <w:r>
         <w:rPr>
-          <w:rFonts w:ascii="Calibri" w:hAnsi="Calibri"/>
+          <w:rFonts w:ascii="Calibri" w:hAnsi="Calibri" w:cs="Calibri"/>
           <w:b w:val="0"/>
           <w:i w:val="0"/>
-          <w:color w:val="222222"/>
+          <w:color w:val="1A1A1A"/>
           <w:sz w:val="22"/>
         </w:rPr>
         <w:t>Title (if company)  ________________________________</w:t>
@@ -860,10 +882,10 @@
       </w:pPr>
       <w:r>
         <w:rPr>
-          <w:rFonts w:ascii="Calibri" w:hAnsi="Calibri"/>
+          <w:rFonts w:ascii="Calibri" w:hAnsi="Calibri" w:cs="Calibri"/>
           <w:b w:val="0"/>
           <w:i w:val="0"/>
-          <w:color w:val="222222"/>
+          <w:color w:val="1A1A1A"/>
           <w:sz w:val="22"/>
         </w:rPr>
         <w:t>Date  ________________________________</w:t>
@@ -875,11 +897,11 @@
       </w:pPr>
       <w:r>
         <w:rPr>
-          <w:rFonts w:ascii="Calibri" w:hAnsi="Calibri"/>
+          <w:rFonts w:ascii="Calibri" w:hAnsi="Calibri" w:cs="Calibri"/>
           <w:b w:val="0"/>
           <w:i/>
-          <w:color w:val="4B4F54"/>
-          <w:sz w:val="18"/>
+          <w:color w:val="1A1A1A"/>
+          <w:sz w:val="22"/>
         </w:rPr>
         <w:t>DRAFT  ·  Not for execution  ·  Fremont Makers LLC  ·  719 Main Street, Cañon City, CO 81212</w:t>
       </w:r>

</xml_diff>